<commit_message>
Add Figma agent case study and voice guide
This change adds a new portfolio case study on teaching Figma's agent to use W-UI, includes the related route in prerendering, and updates project cards/detail pages to handle missing media and duration fields gracefully. It also adds Davy's writing voice guidance so future narrative copy stays aligned with his actual tone and reasoning.
</commit_message>
<xml_diff>
--- a/public/files/Davy_Jones_Resume_2026.docx
+++ b/public/files/Davy_Jones_Resume_2026.docx
@@ -31,7 +31,55 @@
         <w:rPr>
           <w:rFonts w:ascii="Calibri" w:hAnsi="Calibri" w:cs="Calibri"/>
         </w:rPr>
-        <w:t>Systems-oriented Senior UI Designer with over six years of enterprise experience unifying complex operational workflows and multi-brand product ecosystems into clear, scalable interfaces. Specializes in bridging the gap between design intent and production code through robust component architecture, design tokens, and frontend standards (Figma, KendoReact, Storybook). Leverages AI-assisted tooling (GitHub Copilot, Claude Code, Figma MCP) to accelerate prototyping, documentation, and cross-functional alignment across product, engineering, and accessibility standards.</w:t>
+        <w:t xml:space="preserve">Senior UI designer working where design systems, product UI, and front-end code meet. A lot of my time goes into figuring out how designs make it into production: Figma components and tokens, </w:t>
+      </w:r>
+      <w:proofErr w:type="spellStart"/>
+      <w:r>
+        <w:rPr>
+          <w:rFonts w:ascii="Calibri" w:hAnsi="Calibri" w:cs="Calibri"/>
+        </w:rPr>
+        <w:t>KendoReact</w:t>
+      </w:r>
+      <w:proofErr w:type="spellEnd"/>
+      <w:r>
+        <w:rPr>
+          <w:rFonts w:ascii="Calibri" w:hAnsi="Calibri" w:cs="Calibri"/>
+        </w:rPr>
+        <w:t xml:space="preserve"> and </w:t>
+      </w:r>
+      <w:proofErr w:type="spellStart"/>
+      <w:r>
+        <w:rPr>
+          <w:rFonts w:ascii="Calibri" w:hAnsi="Calibri" w:cs="Calibri"/>
+        </w:rPr>
+        <w:t>ThemeBuilder</w:t>
+      </w:r>
+      <w:proofErr w:type="spellEnd"/>
+      <w:r>
+        <w:rPr>
+          <w:rFonts w:ascii="Calibri" w:hAnsi="Calibri" w:cs="Calibri"/>
+        </w:rPr>
+        <w:t xml:space="preserve">, the guidelines, and the AI tools developers build from. Lately that means testing where tools like Figma agents, Figma Make, GitHub Copilot, and Lovable </w:t>
+      </w:r>
+      <w:proofErr w:type="gramStart"/>
+      <w:r>
+        <w:rPr>
+          <w:rFonts w:ascii="Calibri" w:hAnsi="Calibri" w:cs="Calibri"/>
+        </w:rPr>
+        <w:t xml:space="preserve">actually </w:t>
+      </w:r>
+      <w:r>
+        <w:rPr>
+          <w:rFonts w:ascii="Calibri" w:hAnsi="Calibri" w:cs="Calibri"/>
+        </w:rPr>
+        <w:t>help</w:t>
+      </w:r>
+      <w:proofErr w:type="gramEnd"/>
+      <w:r>
+        <w:rPr>
+          <w:rFonts w:ascii="Calibri" w:hAnsi="Calibri" w:cs="Calibri"/>
+        </w:rPr>
+        <w:t>, and building the skills and guidelines that keep their output on the design system.</w:t>
       </w:r>
     </w:p>
     <w:p>
@@ -56,299 +104,7 @@
         <w:rPr>
           <w:rFonts w:ascii="Calibri" w:hAnsi="Calibri" w:cs="Calibri"/>
         </w:rPr>
-        <w:t>Core competencies</w:t>
-      </w:r>
-    </w:p>
-    <w:tbl>
-      <w:tblPr>
-        <w:tblStyle w:val="TableGrid"/>
-        <w:tblW w:w="10236" w:type="dxa"/>
-        <w:tblInd w:w="-90" w:type="dxa"/>
-        <w:tblBorders>
-          <w:top w:val="none" w:sz="0" w:space="0" w:color="auto"/>
-          <w:left w:val="none" w:sz="0" w:space="0" w:color="auto"/>
-          <w:bottom w:val="none" w:sz="0" w:space="0" w:color="auto"/>
-          <w:right w:val="none" w:sz="0" w:space="0" w:color="auto"/>
-          <w:insideH w:val="none" w:sz="0" w:space="0" w:color="auto"/>
-          <w:insideV w:val="none" w:sz="0" w:space="0" w:color="auto"/>
-        </w:tblBorders>
-        <w:tblLook w:val="0480" w:firstRow="0" w:lastRow="0" w:firstColumn="1" w:lastColumn="0" w:noHBand="0" w:noVBand="1"/>
-      </w:tblPr>
-      <w:tblGrid>
-        <w:gridCol w:w="2610"/>
-        <w:gridCol w:w="7626"/>
-      </w:tblGrid>
-      <w:tr>
-        <w:trPr>
-          <w:trHeight w:val="66"/>
-        </w:trPr>
-        <w:tc>
-          <w:tcPr>
-            <w:tcW w:w="2610" w:type="dxa"/>
-          </w:tcPr>
-          <w:p>
-            <w:pPr>
-              <w:pStyle w:val="Heading3"/>
-              <w:spacing w:after="80"/>
-              <w:rPr>
-                <w:rFonts w:ascii="Calibri" w:hAnsi="Calibri" w:cs="Calibri"/>
-                <w:color w:val="000000" w:themeColor="text1"/>
-              </w:rPr>
-            </w:pPr>
-            <w:r>
-              <w:rPr>
-                <w:rFonts w:ascii="Calibri" w:hAnsi="Calibri" w:cs="Calibri"/>
-                <w:b/>
-                <w:bCs/>
-                <w:color w:val="000000" w:themeColor="text1"/>
-                <w:sz w:val="20"/>
-                <w:szCs w:val="20"/>
-              </w:rPr>
-              <w:t>UI &amp; UX Design</w:t>
-            </w:r>
-          </w:p>
-        </w:tc>
-        <w:tc>
-          <w:tcPr>
-            <w:tcW w:w="7626" w:type="dxa"/>
-          </w:tcPr>
-          <w:p>
-            <w:pPr>
-              <w:pStyle w:val="Heading3"/>
-              <w:spacing w:after="80"/>
-              <w:rPr>
-                <w:rFonts w:ascii="Calibri" w:hAnsi="Calibri" w:cs="Calibri"/>
-                <w:color w:val="000000" w:themeColor="text1"/>
-              </w:rPr>
-            </w:pPr>
-            <w:r>
-              <w:rPr>
-                <w:rFonts w:ascii="Calibri" w:hAnsi="Calibri" w:cs="Calibri"/>
-                <w:color w:val="000000" w:themeColor="text1"/>
-                <w:sz w:val="20"/>
-                <w:szCs w:val="20"/>
-              </w:rPr>
-              <w:t>Complex Operational Workflows, Dashboard &amp; Data-Dense UI, Visual Hierarchy &amp; Typography,</w:t>
-            </w:r>
-            <w:r>
-              <w:rPr>
-                <w:rFonts w:ascii="Calibri" w:hAnsi="Calibri" w:cs="Calibri"/>
-                <w:color w:val="000000" w:themeColor="text1"/>
-              </w:rPr>
-              <w:t xml:space="preserve"> </w:t>
-            </w:r>
-            <w:r>
-              <w:rPr>
-                <w:rFonts w:ascii="Calibri" w:hAnsi="Calibri" w:cs="Calibri"/>
-                <w:color w:val="000000" w:themeColor="text1"/>
-                <w:sz w:val="20"/>
-                <w:szCs w:val="20"/>
-              </w:rPr>
-              <w:t>Interaction Design, User Journey Mapping, Rapid Prototyping</w:t>
-            </w:r>
-          </w:p>
-        </w:tc>
-      </w:tr>
-      <w:tr>
-        <w:trPr>
-          <w:trHeight w:val="450"/>
-        </w:trPr>
-        <w:tc>
-          <w:tcPr>
-            <w:tcW w:w="2610" w:type="dxa"/>
-          </w:tcPr>
-          <w:p>
-            <w:pPr>
-              <w:pStyle w:val="Heading3"/>
-              <w:spacing w:after="80"/>
-              <w:rPr>
-                <w:rFonts w:ascii="Calibri" w:hAnsi="Calibri" w:cs="Calibri"/>
-                <w:b/>
-                <w:bCs/>
-                <w:color w:val="000000" w:themeColor="text1"/>
-                <w:sz w:val="20"/>
-                <w:szCs w:val="20"/>
-              </w:rPr>
-            </w:pPr>
-            <w:r>
-              <w:rPr>
-                <w:rFonts w:ascii="Calibri" w:hAnsi="Calibri" w:cs="Calibri"/>
-                <w:b/>
-                <w:bCs/>
-                <w:color w:val="000000" w:themeColor="text1"/>
-                <w:sz w:val="20"/>
-                <w:szCs w:val="20"/>
-              </w:rPr>
-              <w:t>Design Systems</w:t>
-            </w:r>
-          </w:p>
-        </w:tc>
-        <w:tc>
-          <w:tcPr>
-            <w:tcW w:w="7626" w:type="dxa"/>
-          </w:tcPr>
-          <w:p>
-            <w:pPr>
-              <w:tabs>
-                <w:tab w:val="left" w:pos="2160"/>
-              </w:tabs>
-              <w:spacing w:after="80"/>
-              <w:rPr>
-                <w:rFonts w:ascii="Calibri" w:hAnsi="Calibri" w:cs="Calibri"/>
-              </w:rPr>
-            </w:pPr>
-            <w:r>
-              <w:rPr>
-                <w:rFonts w:ascii="Calibri" w:hAnsi="Calibri" w:cs="Calibri"/>
-              </w:rPr>
-              <w:t>Enterprise Design Systems, Component Architecture, Design Tokens, Design-to-Development Workflows, Web Accessibility (WCAG AA), KendoReact, Storybook</w:t>
-            </w:r>
-          </w:p>
-        </w:tc>
-      </w:tr>
-      <w:tr>
-        <w:trPr>
-          <w:trHeight w:val="513"/>
-        </w:trPr>
-        <w:tc>
-          <w:tcPr>
-            <w:tcW w:w="2610" w:type="dxa"/>
-          </w:tcPr>
-          <w:p>
-            <w:pPr>
-              <w:pStyle w:val="Heading3"/>
-              <w:spacing w:after="80"/>
-              <w:rPr>
-                <w:rFonts w:ascii="Calibri" w:hAnsi="Calibri" w:cs="Calibri"/>
-                <w:b/>
-                <w:bCs/>
-                <w:color w:val="000000" w:themeColor="text1"/>
-                <w:sz w:val="20"/>
-                <w:szCs w:val="20"/>
-              </w:rPr>
-            </w:pPr>
-            <w:r>
-              <w:rPr>
-                <w:rFonts w:ascii="Calibri" w:hAnsi="Calibri" w:cs="Calibri"/>
-                <w:b/>
-                <w:bCs/>
-                <w:color w:val="000000" w:themeColor="text1"/>
-                <w:sz w:val="20"/>
-                <w:szCs w:val="20"/>
-              </w:rPr>
-              <w:t>AI &amp; emerging workflows</w:t>
-            </w:r>
-          </w:p>
-        </w:tc>
-        <w:tc>
-          <w:tcPr>
-            <w:tcW w:w="7626" w:type="dxa"/>
-          </w:tcPr>
-          <w:p>
-            <w:pPr>
-              <w:tabs>
-                <w:tab w:val="left" w:pos="2160"/>
-              </w:tabs>
-              <w:spacing w:after="80"/>
-              <w:rPr>
-                <w:rFonts w:ascii="Calibri" w:hAnsi="Calibri" w:cs="Calibri"/>
-              </w:rPr>
-            </w:pPr>
-            <w:r>
-              <w:rPr>
-                <w:rFonts w:ascii="Calibri" w:hAnsi="Calibri" w:cs="Calibri"/>
-              </w:rPr>
-              <w:t xml:space="preserve">Claude Code, </w:t>
-            </w:r>
-            <w:r>
-              <w:rPr>
-                <w:rFonts w:ascii="Calibri" w:hAnsi="Calibri" w:cs="Calibri"/>
-              </w:rPr>
-              <w:t>GitHub Copilot, Figma MCP, Lovable, AI-Assisted Prototyping, Context Engineering, DesignOps</w:t>
-            </w:r>
-          </w:p>
-        </w:tc>
-      </w:tr>
-      <w:tr>
-        <w:tc>
-          <w:tcPr>
-            <w:tcW w:w="2610" w:type="dxa"/>
-          </w:tcPr>
-          <w:p>
-            <w:pPr>
-              <w:pStyle w:val="Heading3"/>
-              <w:spacing w:after="80"/>
-              <w:rPr>
-                <w:rFonts w:ascii="Calibri" w:hAnsi="Calibri" w:cs="Calibri"/>
-                <w:b/>
-                <w:bCs/>
-                <w:color w:val="000000" w:themeColor="text1"/>
-                <w:sz w:val="20"/>
-                <w:szCs w:val="20"/>
-              </w:rPr>
-            </w:pPr>
-            <w:r>
-              <w:rPr>
-                <w:rFonts w:ascii="Calibri" w:hAnsi="Calibri" w:cs="Calibri"/>
-                <w:b/>
-                <w:bCs/>
-                <w:color w:val="000000" w:themeColor="text1"/>
-                <w:sz w:val="20"/>
-                <w:szCs w:val="20"/>
-              </w:rPr>
-              <w:t>Cross-Functional Leadership</w:t>
-            </w:r>
-          </w:p>
-        </w:tc>
-        <w:tc>
-          <w:tcPr>
-            <w:tcW w:w="7626" w:type="dxa"/>
-          </w:tcPr>
-          <w:p>
-            <w:pPr>
-              <w:tabs>
-                <w:tab w:val="left" w:pos="2160"/>
-              </w:tabs>
-              <w:spacing w:after="80"/>
-              <w:ind w:right="-21"/>
-              <w:rPr>
-                <w:rFonts w:ascii="Calibri" w:hAnsi="Calibri" w:cs="Calibri"/>
-              </w:rPr>
-            </w:pPr>
-            <w:r>
-              <w:rPr>
-                <w:rFonts w:ascii="Calibri" w:hAnsi="Calibri" w:cs="Calibri"/>
-              </w:rPr>
-              <w:t>Engineering Partnership, UX Governance &amp; Stewardship, Design Reviews, Agile Delivery, Technical Communication</w:t>
-            </w:r>
-          </w:p>
-        </w:tc>
-      </w:tr>
-    </w:tbl>
-    <w:p>
-      <w:pPr>
-        <w:pStyle w:val="Heading2"/>
-        <w:pBdr>
-          <w:bottom w:val="single" w:sz="6" w:space="1" w:color="auto"/>
-        </w:pBdr>
-        <w:rPr>
-          <w:rFonts w:ascii="Calibri" w:hAnsi="Calibri" w:cs="Calibri"/>
-        </w:rPr>
-      </w:pPr>
-    </w:p>
-    <w:p>
-      <w:pPr>
-        <w:pStyle w:val="Heading2"/>
-        <w:spacing w:before="200" w:after="80"/>
-        <w:rPr>
-          <w:rFonts w:ascii="Calibri" w:hAnsi="Calibri" w:cs="Calibri"/>
-        </w:rPr>
-      </w:pPr>
-      <w:r>
-        <w:rPr>
-          <w:rFonts w:ascii="Calibri" w:hAnsi="Calibri" w:cs="Calibri"/>
-        </w:rPr>
-        <w:t>Personal experience</w:t>
+        <w:t>Experience</w:t>
       </w:r>
     </w:p>
     <w:p>
@@ -395,37 +151,7 @@
         <w:rPr>
           <w:rFonts w:ascii="Calibri" w:hAnsi="Calibri" w:cs="Calibri"/>
         </w:rPr>
-        <w:t xml:space="preserve"> </w:t>
-      </w:r>
-      <w:r>
-        <w:rPr>
-          <w:rFonts w:ascii="Calibri" w:hAnsi="Calibri" w:cs="Calibri"/>
-        </w:rPr>
-        <w:t>(</w:t>
-      </w:r>
-      <w:r>
-        <w:rPr>
-          <w:rFonts w:ascii="Calibri" w:hAnsi="Calibri" w:cs="Calibri"/>
-        </w:rPr>
-        <w:t xml:space="preserve">Apr 2024 </w:t>
-      </w:r>
-      <w:r>
-        <w:rPr>
-          <w:rFonts w:ascii="Calibri" w:hAnsi="Calibri" w:cs="Calibri"/>
-        </w:rPr>
-        <w:t>-</w:t>
-      </w:r>
-      <w:r>
-        <w:rPr>
-          <w:rFonts w:ascii="Calibri" w:hAnsi="Calibri" w:cs="Calibri"/>
-        </w:rPr>
-        <w:t xml:space="preserve"> Present</w:t>
-      </w:r>
-      <w:r>
-        <w:rPr>
-          <w:rFonts w:ascii="Calibri" w:hAnsi="Calibri" w:cs="Calibri"/>
-        </w:rPr>
-        <w:t>)</w:t>
+        <w:t xml:space="preserve"> (Apr 2024 - Present)</w:t>
       </w:r>
     </w:p>
     <w:p>
@@ -445,7 +171,21 @@
         <w:rPr>
           <w:rFonts w:ascii="Calibri" w:hAnsi="Calibri" w:cs="Calibri"/>
         </w:rPr>
-        <w:t>Set UX direction, component architecture, and design system governance across the merged Wheels, Donlen, and LeasePlan USA product ecosystems spanning desktop, web, and mobile surfaces.</w:t>
+        <w:t xml:space="preserve">Own the design system across desktop, web, and mobile, bringing the Wheels, </w:t>
+      </w:r>
+      <w:proofErr w:type="spellStart"/>
+      <w:r>
+        <w:rPr>
+          <w:rFonts w:ascii="Calibri" w:hAnsi="Calibri" w:cs="Calibri"/>
+        </w:rPr>
+        <w:t>Donlen</w:t>
+      </w:r>
+      <w:proofErr w:type="spellEnd"/>
+      <w:r>
+        <w:rPr>
+          <w:rFonts w:ascii="Calibri" w:hAnsi="Calibri" w:cs="Calibri"/>
+        </w:rPr>
+        <w:t>, and LeasePlan USA products under one set of components, patterns, and guidelines.</w:t>
       </w:r>
     </w:p>
     <w:p>
@@ -465,7 +205,23 @@
         <w:rPr>
           <w:rFonts w:ascii="Calibri" w:hAnsi="Calibri" w:cs="Calibri"/>
         </w:rPr>
-        <w:t>Unified three legacy organizations under a single enterprise design language, delivering 60+ production KendoReact components, accessible interaction patterns, and a feature-rich data grid.</w:t>
+        <w:t xml:space="preserve">Led the build and launch of </w:t>
+      </w:r>
+      <w:proofErr w:type="spellStart"/>
+      <w:proofErr w:type="gramStart"/>
+      <w:r>
+        <w:rPr>
+          <w:rFonts w:ascii="Calibri" w:hAnsi="Calibri" w:cs="Calibri"/>
+        </w:rPr>
+        <w:t>ui.wheels</w:t>
+      </w:r>
+      <w:proofErr w:type="spellEnd"/>
+      <w:proofErr w:type="gramEnd"/>
+      <w:r>
+        <w:rPr>
+          <w:rFonts w:ascii="Calibri" w:hAnsi="Calibri" w:cs="Calibri"/>
+        </w:rPr>
+        <w:t>, the design system's documentation site, with contributions from the UX team. I own and maintain it now that it's live.</w:t>
       </w:r>
     </w:p>
     <w:p>
@@ -485,7 +241,41 @@
         <w:rPr>
           <w:rFonts w:ascii="Calibri" w:hAnsi="Calibri" w:cs="Calibri"/>
         </w:rPr>
-        <w:t>Established parity between Figma, ThemeBuilder, and Storybook, eliminating implementation ambiguity and cutting developer turnaround time by up to 50%.</w:t>
+        <w:t xml:space="preserve">Maintain both the Figma library and the </w:t>
+      </w:r>
+      <w:proofErr w:type="spellStart"/>
+      <w:r>
+        <w:rPr>
+          <w:rFonts w:ascii="Calibri" w:hAnsi="Calibri" w:cs="Calibri"/>
+        </w:rPr>
+        <w:t>KendoReact</w:t>
+      </w:r>
+      <w:proofErr w:type="spellEnd"/>
+      <w:r>
+        <w:rPr>
+          <w:rFonts w:ascii="Calibri" w:hAnsi="Calibri" w:cs="Calibri"/>
+        </w:rPr>
+        <w:t xml:space="preserve"> theme in </w:t>
+      </w:r>
+      <w:proofErr w:type="spellStart"/>
+      <w:r>
+        <w:rPr>
+          <w:rFonts w:ascii="Calibri" w:hAnsi="Calibri" w:cs="Calibri"/>
+        </w:rPr>
+        <w:t>ThemeBuilder</w:t>
+      </w:r>
+      <w:proofErr w:type="spellEnd"/>
+      <w:r>
+        <w:rPr>
+          <w:rFonts w:ascii="Calibri" w:hAnsi="Calibri" w:cs="Calibri"/>
+        </w:rPr>
+        <w:t xml:space="preserve"> and</w:t>
+      </w:r>
+      <w:r>
+        <w:rPr>
+          <w:rFonts w:ascii="Calibri" w:hAnsi="Calibri" w:cs="Calibri"/>
+        </w:rPr>
+        <w:t xml:space="preserve"> keep the two in sync so what gets designed matches what ships.</w:t>
       </w:r>
     </w:p>
     <w:p>
@@ -505,7 +295,21 @@
         <w:rPr>
           <w:rFonts w:ascii="Calibri" w:hAnsi="Calibri" w:cs="Calibri"/>
         </w:rPr>
-        <w:t>Designed complex multi-step transactional flows and data-dense operational surfaces (e.g., FleetView 4.0, New Driver Experience, Mileage Entry, Book Appointment) to maintain visual legibility under real-world complexity.</w:t>
+        <w:t xml:space="preserve">Design data-dense operational screens and multi-step flows, including </w:t>
+      </w:r>
+      <w:proofErr w:type="spellStart"/>
+      <w:r>
+        <w:rPr>
+          <w:rFonts w:ascii="Calibri" w:hAnsi="Calibri" w:cs="Calibri"/>
+        </w:rPr>
+        <w:t>FleetView</w:t>
+      </w:r>
+      <w:proofErr w:type="spellEnd"/>
+      <w:r>
+        <w:rPr>
+          <w:rFonts w:ascii="Calibri" w:hAnsi="Calibri" w:cs="Calibri"/>
+        </w:rPr>
+        <w:t xml:space="preserve"> 4.0, New Driver Experience, Mileage Entry, and Book Appointment.</w:t>
       </w:r>
     </w:p>
     <w:p>
@@ -525,7 +329,27 @@
         <w:rPr>
           <w:rFonts w:ascii="Calibri" w:hAnsi="Calibri" w:cs="Calibri"/>
         </w:rPr>
-        <w:t>Embedded WCAG AA accessibility into foundational design tokens and core UI components, ensuring new feature releases remain inclusive by default.</w:t>
+        <w:t>Build WCAG AA contrast and states into the tokens and core components, so new features start accessible instead of getting fixed later.</w:t>
+      </w:r>
+    </w:p>
+    <w:p>
+      <w:pPr>
+        <w:pStyle w:val="ListParagraph"/>
+        <w:numPr>
+          <w:ilvl w:val="0"/>
+          <w:numId w:val="2"/>
+        </w:numPr>
+        <w:spacing w:after="60"/>
+        <w:ind w:hanging="270"/>
+        <w:rPr>
+          <w:rFonts w:ascii="Calibri" w:hAnsi="Calibri" w:cs="Calibri"/>
+        </w:rPr>
+      </w:pPr>
+      <w:r>
+        <w:rPr>
+          <w:rFonts w:ascii="Calibri" w:hAnsi="Calibri" w:cs="Calibri"/>
+        </w:rPr>
+        <w:t>Test AI tools on real work and build what makes them usable. This includes a skill (first in Copilot, then in Figma agents) that redraws Lovable prototypes in Figma with our components, and a Figma Make kit whose guidelines keep output on the Kendo theme.</w:t>
       </w:r>
     </w:p>
     <w:p>
@@ -544,7 +368,7 @@
         <w:rPr>
           <w:rFonts w:ascii="Calibri" w:hAnsi="Calibri" w:cs="Calibri"/>
         </w:rPr>
-        <w:t>Explored and integrated AI-assisted workflows (GitHub Copilot, Claude Code, Figma MCP, Lovable) for rapid prototyping, documentation generation, and context engineering to streamline design-to-engineering handoffs.</w:t>
+        <w:t>Lead the team's AI design and workflow check-ins, where designers share what's working, what isn't, and where each tool fits.</w:t>
       </w:r>
     </w:p>
     <w:p>
@@ -567,31 +391,7 @@
         <w:rPr>
           <w:rFonts w:ascii="Calibri" w:hAnsi="Calibri" w:cs="Calibri"/>
         </w:rPr>
-        <w:t>(</w:t>
-      </w:r>
-      <w:r>
-        <w:rPr>
-          <w:rFonts w:ascii="Calibri" w:hAnsi="Calibri" w:cs="Calibri"/>
-        </w:rPr>
-        <w:t xml:space="preserve">Aug 2020 </w:t>
-      </w:r>
-      <w:r>
-        <w:rPr>
-          <w:rFonts w:ascii="Calibri" w:hAnsi="Calibri" w:cs="Calibri"/>
-        </w:rPr>
-        <w:t>-</w:t>
-      </w:r>
-      <w:r>
-        <w:rPr>
-          <w:rFonts w:ascii="Calibri" w:hAnsi="Calibri" w:cs="Calibri"/>
-        </w:rPr>
-        <w:t xml:space="preserve"> Apr 2024</w:t>
-      </w:r>
-      <w:r>
-        <w:rPr>
-          <w:rFonts w:ascii="Calibri" w:hAnsi="Calibri" w:cs="Calibri"/>
-        </w:rPr>
-        <w:t>)</w:t>
+        <w:t>(Aug 2020 - Apr 2024)</w:t>
       </w:r>
     </w:p>
     <w:p>
@@ -611,7 +411,7 @@
         <w:rPr>
           <w:rFonts w:ascii="Calibri" w:hAnsi="Calibri" w:cs="Calibri"/>
         </w:rPr>
-        <w:t>Spearheaded the organization-wide migration to Figma as the primary design tool, establishing token strategies, reusable libraries, and component structures that formed the baseline for the enterprise design system.</w:t>
+        <w:t>Led the team's move to Figma and set up the token structure, shared libraries, and components that became the base of the design system.</w:t>
       </w:r>
     </w:p>
     <w:p>
@@ -631,7 +431,7 @@
         <w:rPr>
           <w:rFonts w:ascii="Calibri" w:hAnsi="Calibri" w:cs="Calibri"/>
         </w:rPr>
-        <w:t>Designed end-to-end enterprise interfaces for fleet managers, drivers, and internal operations teams, standardizing contrast, typography, and state behaviors.</w:t>
+        <w:t>Designed end-to-end interfaces for fleet managers, drivers, and internal operations teams, standardizing contrast, typography, and component states along the way.</w:t>
       </w:r>
     </w:p>
     <w:p>
@@ -651,7 +451,7 @@
         <w:rPr>
           <w:rFonts w:ascii="Calibri" w:hAnsi="Calibri" w:cs="Calibri"/>
         </w:rPr>
-        <w:t>Co-designed handoff workflows with UI development principals, producing comprehensive UX specs and QA-aligned documentation that reduced rework and improved release consistency.</w:t>
+        <w:t>Worked with UI development leads on the handoff process: specs, annotations, and QA documentation developers could build from with less back-and-forth.</w:t>
       </w:r>
     </w:p>
     <w:p>
@@ -671,7 +471,7 @@
         <w:rPr>
           <w:rFonts w:ascii="Calibri" w:hAnsi="Calibri" w:cs="Calibri"/>
         </w:rPr>
-        <w:t>Partnered across Marketing Cloud and reporting teams (Tableau) to extend core system patterns into adjacent digital touchpoints.</w:t>
+        <w:t>Extended design system patterns to the Marketing Cloud and Tableau reporting teams.</w:t>
       </w:r>
     </w:p>
     <w:p>
@@ -688,49 +488,28 @@
           <w:sz w:val="22"/>
           <w:szCs w:val="22"/>
         </w:rPr>
-        <w:lastRenderedPageBreak/>
-        <w:br/>
-      </w:r>
+        <w:t xml:space="preserve">Purdue University Northwest </w:t>
+      </w:r>
+      <w:r>
+        <w:rPr>
+          <w:rFonts w:ascii="Calibri" w:hAnsi="Calibri" w:cs="Calibri"/>
+        </w:rPr>
+        <w:t>(remote)</w:t>
+      </w:r>
+    </w:p>
+    <w:p>
+      <w:pPr>
+        <w:spacing w:before="80"/>
+        <w:ind w:left="446"/>
+        <w:rPr>
+          <w:rFonts w:ascii="Calibri" w:hAnsi="Calibri" w:cs="Calibri"/>
+        </w:rPr>
+      </w:pPr>
       <w:r>
         <w:rPr>
           <w:rFonts w:ascii="Calibri" w:hAnsi="Calibri" w:cs="Calibri"/>
           <w:b/>
           <w:bCs/>
-          <w:sz w:val="22"/>
-          <w:szCs w:val="22"/>
-        </w:rPr>
-        <w:t xml:space="preserve">Purdue University Northwest </w:t>
-      </w:r>
-      <w:r>
-        <w:rPr>
-          <w:rFonts w:ascii="Calibri" w:hAnsi="Calibri" w:cs="Calibri"/>
-          <w:b/>
-          <w:bCs/>
-          <w:sz w:val="22"/>
-          <w:szCs w:val="22"/>
-        </w:rPr>
-        <w:t>(</w:t>
-      </w:r>
-      <w:r>
-        <w:rPr>
-          <w:rFonts w:ascii="Calibri" w:hAnsi="Calibri" w:cs="Calibri"/>
-        </w:rPr>
-        <w:t>remote)</w:t>
-      </w:r>
-    </w:p>
-    <w:p>
-      <w:pPr>
-        <w:spacing w:before="80"/>
-        <w:ind w:left="446"/>
-        <w:rPr>
-          <w:rFonts w:ascii="Calibri" w:hAnsi="Calibri" w:cs="Calibri"/>
-        </w:rPr>
-      </w:pPr>
-      <w:r>
-        <w:rPr>
-          <w:rFonts w:ascii="Calibri" w:hAnsi="Calibri" w:cs="Calibri"/>
-          <w:b/>
-          <w:bCs/>
         </w:rPr>
         <w:t xml:space="preserve">Design Consultant </w:t>
       </w:r>
@@ -738,31 +517,7 @@
         <w:rPr>
           <w:rFonts w:ascii="Calibri" w:hAnsi="Calibri" w:cs="Calibri"/>
         </w:rPr>
-        <w:t>(</w:t>
-      </w:r>
-      <w:r>
-        <w:rPr>
-          <w:rFonts w:ascii="Calibri" w:hAnsi="Calibri" w:cs="Calibri"/>
-        </w:rPr>
-        <w:t xml:space="preserve">Feb 2023 </w:t>
-      </w:r>
-      <w:r>
-        <w:rPr>
-          <w:rFonts w:ascii="Calibri" w:hAnsi="Calibri" w:cs="Calibri"/>
-        </w:rPr>
-        <w:t xml:space="preserve">- </w:t>
-      </w:r>
-      <w:r>
-        <w:rPr>
-          <w:rFonts w:ascii="Calibri" w:hAnsi="Calibri" w:cs="Calibri"/>
-        </w:rPr>
-        <w:t>Apr 202</w:t>
-      </w:r>
-      <w:r>
-        <w:rPr>
-          <w:rFonts w:ascii="Calibri" w:hAnsi="Calibri" w:cs="Calibri"/>
-        </w:rPr>
-        <w:t>3)</w:t>
+        <w:t>(Feb 2023 - Apr 2023)</w:t>
       </w:r>
     </w:p>
     <w:p>
@@ -782,11 +537,12 @@
         <w:rPr>
           <w:rFonts w:ascii="Calibri" w:hAnsi="Calibri" w:cs="Calibri"/>
         </w:rPr>
-        <w:t>Led the application redesign for the NLN Center of Excellence, converting complex multi-step submission requirements into clear user flows and high-fidelity interactive prototypes.</w:t>
-      </w:r>
-    </w:p>
-    <w:p>
-      <w:pPr>
+        <w:t>Redesigned the application process for the NLN Center of Excellence, turning a long, multi-step submission into clearer flows and interactive prototypes.</w:t>
+      </w:r>
+    </w:p>
+    <w:p>
+      <w:pPr>
+        <w:keepNext/>
         <w:rPr>
           <w:rFonts w:ascii="Calibri" w:hAnsi="Calibri" w:cs="Calibri"/>
         </w:rPr>
@@ -805,23 +561,12 @@
         <w:rPr>
           <w:rFonts w:ascii="Calibri" w:hAnsi="Calibri" w:cs="Calibri"/>
         </w:rPr>
-        <w:t>(</w:t>
-      </w:r>
-      <w:r>
-        <w:rPr>
-          <w:rFonts w:ascii="Calibri" w:hAnsi="Calibri" w:cs="Calibri"/>
-        </w:rPr>
-        <w:t>Michigan City, IN</w:t>
-      </w:r>
-      <w:r>
-        <w:rPr>
-          <w:rFonts w:ascii="Calibri" w:hAnsi="Calibri" w:cs="Calibri"/>
-        </w:rPr>
-        <w:t>)</w:t>
-      </w:r>
-    </w:p>
-    <w:p>
-      <w:pPr>
+        <w:t>(Michigan City, IN)</w:t>
+      </w:r>
+    </w:p>
+    <w:p>
+      <w:pPr>
+        <w:keepNext/>
         <w:spacing w:before="80"/>
         <w:ind w:left="446"/>
         <w:rPr>
@@ -834,33 +579,13 @@
           <w:b/>
           <w:bCs/>
         </w:rPr>
-        <w:t>U</w:t>
-      </w:r>
-      <w:r>
-        <w:rPr>
-          <w:rFonts w:ascii="Calibri" w:hAnsi="Calibri" w:cs="Calibri"/>
-          <w:b/>
-          <w:bCs/>
-        </w:rPr>
-        <w:t xml:space="preserve">X/UI Designer </w:t>
-      </w:r>
-      <w:r>
-        <w:rPr>
-          <w:rFonts w:ascii="Calibri" w:hAnsi="Calibri" w:cs="Calibri"/>
-        </w:rPr>
-        <w:t>| Apr 2019</w:t>
-      </w:r>
-      <w:r>
-        <w:rPr>
-          <w:rFonts w:ascii="Calibri" w:hAnsi="Calibri" w:cs="Calibri"/>
-        </w:rPr>
-        <w:t>-</w:t>
-      </w:r>
-      <w:r>
-        <w:rPr>
-          <w:rFonts w:ascii="Calibri" w:hAnsi="Calibri" w:cs="Calibri"/>
-        </w:rPr>
-        <w:t xml:space="preserve"> Mar 2020</w:t>
+        <w:t xml:space="preserve">UX/UI Designer </w:t>
+      </w:r>
+      <w:r>
+        <w:rPr>
+          <w:rFonts w:ascii="Calibri" w:hAnsi="Calibri" w:cs="Calibri"/>
+        </w:rPr>
+        <w:t>(Apr 2019 - Mar 2020)</w:t>
       </w:r>
     </w:p>
     <w:p>
@@ -880,7 +605,13 @@
         <w:rPr>
           <w:rFonts w:ascii="Calibri" w:hAnsi="Calibri" w:cs="Calibri"/>
         </w:rPr>
-        <w:t>Established design governance documentation and collaborated with web developers to standardize typography, color usage, and reusable UI components across digital channels.</w:t>
+        <w:t>Wrote the company's first design guidelines and worked with web developers to standardize typography, color, and reusable UI components across its digital channels.</w:t>
+      </w:r>
+      <w:r>
+        <w:rPr>
+          <w:rFonts w:ascii="Calibri" w:hAnsi="Calibri" w:cs="Calibri"/>
+        </w:rPr>
+        <w:br/>
       </w:r>
     </w:p>
     <w:p>
@@ -895,6 +626,7 @@
         <w:rPr>
           <w:rFonts w:ascii="Calibri" w:hAnsi="Calibri" w:cs="Calibri"/>
         </w:rPr>
+        <w:lastRenderedPageBreak/>
         <w:t>Education</w:t>
       </w:r>
     </w:p>
@@ -1030,6 +762,17 @@
     <w:p>
       <w:pPr>
         <w:pStyle w:val="Heading2"/>
+        <w:pBdr>
+          <w:bottom w:val="single" w:sz="6" w:space="1" w:color="auto"/>
+        </w:pBdr>
+        <w:rPr>
+          <w:rFonts w:ascii="Calibri" w:hAnsi="Calibri" w:cs="Calibri"/>
+        </w:rPr>
+      </w:pPr>
+    </w:p>
+    <w:p>
+      <w:pPr>
+        <w:pStyle w:val="Heading2"/>
         <w:spacing w:before="200" w:after="80"/>
         <w:rPr>
           <w:rFonts w:ascii="Calibri" w:hAnsi="Calibri" w:cs="Calibri"/>
@@ -1039,7 +782,7 @@
         <w:rPr>
           <w:rFonts w:ascii="Calibri" w:hAnsi="Calibri" w:cs="Calibri"/>
         </w:rPr>
-        <w:t>Technical toolkit</w:t>
+        <w:t>Skills &amp; tools</w:t>
       </w:r>
     </w:p>
     <w:tbl>
@@ -1086,7 +829,7 @@
                 <w:sz w:val="20"/>
                 <w:szCs w:val="20"/>
               </w:rPr>
-              <w:t>Design &amp; Prototyping</w:t>
+              <w:t>Design</w:t>
             </w:r>
           </w:p>
         </w:tc>
@@ -1110,25 +853,7 @@
                 <w:sz w:val="20"/>
                 <w:szCs w:val="20"/>
               </w:rPr>
-              <w:t xml:space="preserve">Figma, </w:t>
-            </w:r>
-            <w:r>
-              <w:rPr>
-                <w:rFonts w:ascii="Calibri" w:hAnsi="Calibri" w:cs="Calibri"/>
-                <w:color w:val="000000" w:themeColor="text1"/>
-                <w:sz w:val="20"/>
-                <w:szCs w:val="20"/>
-              </w:rPr>
-              <w:t xml:space="preserve">Grid </w:t>
-            </w:r>
-            <w:r>
-              <w:rPr>
-                <w:rFonts w:ascii="Calibri" w:hAnsi="Calibri" w:cs="Calibri"/>
-                <w:color w:val="000000" w:themeColor="text1"/>
-                <w:sz w:val="20"/>
-                <w:szCs w:val="20"/>
-              </w:rPr>
-              <w:t>Auto Layout, Component Libraries, Design Tokens, Miro, Adobe Creative Suite</w:t>
+              <w:t>Figma (components, variables, auto layout), design tokens, interaction design, data-dense and operational UI, user flows, prototyping, WCAG AA accessibility, Miro, Adobe Creative Suite</w:t>
             </w:r>
           </w:p>
         </w:tc>
@@ -1162,7 +887,7 @@
                 <w:sz w:val="20"/>
                 <w:szCs w:val="20"/>
               </w:rPr>
-              <w:t>Engineering &amp; Front-End</w:t>
+              <w:t>Design systems &amp; code</w:t>
             </w:r>
           </w:p>
         </w:tc>
@@ -1180,17 +905,33 @@
                 <w:rFonts w:ascii="Calibri" w:hAnsi="Calibri" w:cs="Calibri"/>
               </w:rPr>
             </w:pPr>
+            <w:proofErr w:type="spellStart"/>
             <w:r>
               <w:rPr>
                 <w:rFonts w:ascii="Calibri" w:hAnsi="Calibri" w:cs="Calibri"/>
               </w:rPr>
-              <w:t>React, TypeScript, KendoReact, ThemeBuilder, HTML5, CSS/SCSS, Storybook, GitHu</w:t>
+              <w:t>KendoReact</w:t>
             </w:r>
+            <w:proofErr w:type="spellEnd"/>
             <w:r>
               <w:rPr>
                 <w:rFonts w:ascii="Calibri" w:hAnsi="Calibri" w:cs="Calibri"/>
               </w:rPr>
-              <w:t>b</w:t>
+              <w:t xml:space="preserve">, </w:t>
+            </w:r>
+            <w:proofErr w:type="spellStart"/>
+            <w:r>
+              <w:rPr>
+                <w:rFonts w:ascii="Calibri" w:hAnsi="Calibri" w:cs="Calibri"/>
+              </w:rPr>
+              <w:t>ThemeBuilder</w:t>
+            </w:r>
+            <w:proofErr w:type="spellEnd"/>
+            <w:r>
+              <w:rPr>
+                <w:rFonts w:ascii="Calibri" w:hAnsi="Calibri" w:cs="Calibri"/>
+              </w:rPr>
+              <w:t>, Storybook, React, TypeScript, HTML, CSS/SCSS, GitHub</w:t>
             </w:r>
           </w:p>
         </w:tc>
@@ -1224,7 +965,7 @@
                 <w:sz w:val="20"/>
                 <w:szCs w:val="20"/>
               </w:rPr>
-              <w:t>AI &amp; DesignOps</w:t>
+              <w:t>AI tools</w:t>
             </w:r>
           </w:p>
         </w:tc>
@@ -1246,7 +987,7 @@
               <w:rPr>
                 <w:rFonts w:ascii="Calibri" w:hAnsi="Calibri" w:cs="Calibri"/>
               </w:rPr>
-              <w:t>GitHub Copilot, Claude Code, Figma MCP, Lovable, Context Engineering</w:t>
+              <w:t>Figma agents and skills, Figma Make, Figma MCP, GitHub Copilot, Claude Code, Lovable</w:t>
             </w:r>
           </w:p>
         </w:tc>
@@ -1413,7 +1154,6 @@
         <w:tab w:val="right" w:pos="10080"/>
       </w:tabs>
       <w:spacing w:after="6"/>
-      <w:cnfStyle w:val="101000000000" w:firstRow="1" w:lastRow="0" w:firstColumn="1" w:lastColumn="0" w:oddVBand="0" w:evenVBand="0" w:oddHBand="0" w:evenHBand="0" w:firstRowFirstColumn="0" w:firstRowLastColumn="0" w:lastRowFirstColumn="0" w:lastRowLastColumn="0"/>
       <w:rPr>
         <w:rFonts w:ascii="Calibri" w:hAnsi="Calibri" w:cs="Calibri"/>
       </w:rPr>
@@ -1422,7 +1162,14 @@
       <w:rPr>
         <w:rFonts w:ascii="Calibri" w:hAnsi="Calibri" w:cs="Calibri"/>
       </w:rPr>
-      <w:t xml:space="preserve">Senior UI Designer </w:t>
+      <w:t xml:space="preserve">Senior UI </w:t>
+    </w:r>
+    <w:proofErr w:type="gramStart"/>
+    <w:r>
+      <w:rPr>
+        <w:rFonts w:ascii="Calibri" w:hAnsi="Calibri" w:cs="Calibri"/>
+      </w:rPr>
+      <w:t xml:space="preserve">Designer </w:t>
     </w:r>
     <w:r>
       <w:rPr>
@@ -1436,6 +1183,7 @@
       </w:rPr>
       <w:t>•</w:t>
     </w:r>
+    <w:proofErr w:type="gramEnd"/>
     <w:r>
       <w:rPr>
         <w:rFonts w:ascii="Calibri" w:hAnsi="Calibri" w:cs="Calibri"/>
@@ -1446,7 +1194,14 @@
       <w:rPr>
         <w:rFonts w:ascii="Calibri" w:hAnsi="Calibri" w:cs="Calibri"/>
       </w:rPr>
-      <w:t xml:space="preserve"> Design Systems &amp; Design Engineering </w:t>
+      <w:t xml:space="preserve"> Design </w:t>
+    </w:r>
+    <w:proofErr w:type="gramStart"/>
+    <w:r>
+      <w:rPr>
+        <w:rFonts w:ascii="Calibri" w:hAnsi="Calibri" w:cs="Calibri"/>
+      </w:rPr>
+      <w:t xml:space="preserve">Systems </w:t>
     </w:r>
     <w:r>
       <w:rPr>
@@ -1460,6 +1215,7 @@
       </w:rPr>
       <w:t>•</w:t>
     </w:r>
+    <w:proofErr w:type="gramEnd"/>
     <w:r>
       <w:rPr>
         <w:rFonts w:ascii="Calibri" w:hAnsi="Calibri" w:cs="Calibri"/>
@@ -1470,8 +1226,16 @@
       <w:rPr>
         <w:rFonts w:ascii="Calibri" w:hAnsi="Calibri" w:cs="Calibri"/>
       </w:rPr>
-      <w:t xml:space="preserve"> Figma + React</w:t>
+      <w:t xml:space="preserve"> Figma + </w:t>
     </w:r>
+    <w:proofErr w:type="spellStart"/>
+    <w:r>
+      <w:rPr>
+        <w:rFonts w:ascii="Calibri" w:hAnsi="Calibri" w:cs="Calibri"/>
+      </w:rPr>
+      <w:t>KendoReact</w:t>
+    </w:r>
+    <w:proofErr w:type="spellEnd"/>
     <w:r>
       <w:rPr>
         <w:rFonts w:ascii="Calibri" w:hAnsi="Calibri" w:cs="Calibri"/>
@@ -1526,34 +1290,7 @@
         <w:sz w:val="21"/>
         <w:szCs w:val="21"/>
       </w:rPr>
-      <w:t xml:space="preserve"> </w:t>
-    </w:r>
-    <w:r>
-      <w:rPr>
-        <w:rFonts w:ascii="Calibri" w:hAnsi="Calibri" w:cs="Calibri"/>
-        <w:color w:val="000000" w:themeColor="text1"/>
-        <w:sz w:val="21"/>
-        <w:szCs w:val="21"/>
-      </w:rPr>
-      <w:t>•</w:t>
-    </w:r>
-    <w:r>
-      <w:rPr>
-        <w:rFonts w:ascii="Calibri" w:hAnsi="Calibri" w:cs="Calibri"/>
-        <w:color w:val="000000" w:themeColor="text1"/>
-        <w:sz w:val="21"/>
-        <w:szCs w:val="21"/>
-      </w:rPr>
-      <w:t xml:space="preserve"> </w:t>
-    </w:r>
-    <w:r>
-      <w:rPr>
-        <w:rFonts w:ascii="Calibri" w:hAnsi="Calibri" w:cs="Calibri"/>
-        <w:color w:val="000000" w:themeColor="text1"/>
-        <w:sz w:val="21"/>
-        <w:szCs w:val="21"/>
-      </w:rPr>
-      <w:t xml:space="preserve"> </w:t>
+      <w:t xml:space="preserve"> •  </w:t>
     </w:r>
     <w:hyperlink r:id="rId2" w:history="1">
       <w:r>
@@ -2521,6 +2258,7 @@
   <w:style w:type="character" w:default="1" w:styleId="DefaultParagraphFont">
     <w:name w:val="Default Paragraph Font"/>
     <w:uiPriority w:val="1"/>
+    <w:semiHidden/>
     <w:unhideWhenUsed/>
   </w:style>
   <w:style w:type="table" w:default="1" w:styleId="TableNormal">

</xml_diff>